<commit_message>
Nomenclature du fichier final sur la page des procédures
Co-Authored-By: Claude Opus 5 <noreply@anthropic.com>
</commit_message>
<xml_diff>
--- a/fichiers/1 - Mode d'emploi - decrire une procedure avec une IA.docx
+++ b/fichiers/1 - Mode d'emploi - decrire une procedure avec une IA.docx
@@ -149,7 +149,7 @@
         <w:t>À la fin, l’IA écrit la procédure</w:t>
       </w:r>
       <w:r>
-        <w:t xml:space="preserve"> — avec un sommaire si elle est longue. Copiez-la et transmettez-la.</w:t>
+        <w:t xml:space="preserve"> — avec un sommaire si elle est longue — et vous donne le nom sous lequel l’enregistrer. Copiez-la et transmettez-la.</w:t>
       </w:r>
     </w:p>
     <w:p>
@@ -205,6 +205,42 @@
           <w:i w:val="0"/>
         </w:rPr>
         <w:t>N’écrivez aucun mot de passe ni code d’accès, même si l’IA insiste pour être précise.</w:t>
+      </w:r>
+    </w:p>
+    <w:p>
+      <w:pPr>
+        <w:pStyle w:val="Heading1"/>
+      </w:pPr>
+      <w:r>
+        <w:rPr>
+          <w:rFonts w:ascii="Calibri" w:hAnsi="Calibri"/>
+          <w:color w:val="0F766E"/>
+        </w:rPr>
+        <w:t>Le nom du fichier</w:t>
+      </w:r>
+    </w:p>
+    <w:p>
+      <w:r>
+        <w:rPr>
+          <w:i w:val="0"/>
+        </w:rPr>
+        <w:t>L’IA vous donne, juste avant la procédure, le nom sous lequel enregistrer le document. Reprenez-le tel quel : c’est ce qui permettra de trier et de retrouver les procédures de tout le Resort.</w:t>
+      </w:r>
+    </w:p>
+    <w:p>
+      <w:r>
+        <w:rPr>
+          <w:i/>
+        </w:rPr>
+        <w:t>procedure-CCRN-JEUX-comptage-caisse-fin-de-service-2026-09</w:t>
+      </w:r>
+    </w:p>
+    <w:p>
+      <w:r>
+        <w:rPr>
+          <w:i w:val="0"/>
+        </w:rPr>
+        <w:t>Le département est choisi dans une liste fermée — JEUX, POKER, MACHINES, HOTEL, RESTAURATION, BAR, CUISINE, ACCUEIL, HOUSEKEEPING, TECHNIQUE, SECURITE, MARKETING, FINANCE, RH, ADMIN, DIRECTION. Les deux derniers éléments sont le nom de la tâche et le mois de rédaction. Word ajoutera l’extension tout seul à l’enregistrement.</w:t>
       </w:r>
     </w:p>
     <w:p>

</xml_diff>

<commit_message>
Liste réelle des départements sur la page des procédures
Co-Authored-By: Claude Opus 5 <noreply@anthropic.com>
</commit_message>
<xml_diff>
--- a/fichiers/1 - Mode d'emploi - decrire une procedure avec une IA.docx
+++ b/fichiers/1 - Mode d'emploi - decrire une procedure avec une IA.docx
@@ -232,7 +232,7 @@
         <w:rPr>
           <w:i/>
         </w:rPr>
-        <w:t>procedure-CCRN-JEUX-comptage-caisse-fin-de-service-2026-09</w:t>
+        <w:t>procedure-CCRN-CAISSE-comptage-caisse-fin-de-service-2026-09</w:t>
       </w:r>
     </w:p>
     <w:p>
@@ -240,7 +240,7 @@
         <w:rPr>
           <w:i w:val="0"/>
         </w:rPr>
-        <w:t>Le département est choisi dans une liste fermée — JEUX, POKER, MACHINES, HOTEL, RESTAURATION, BAR, CUISINE, ACCUEIL, HOUSEKEEPING, TECHNIQUE, SECURITE, MARKETING, FINANCE, RH, ADMIN, DIRECTION. Les deux derniers éléments sont le nom de la tâche et le mois de rédaction. Word ajoutera l’extension tout seul à l’enregistrement.</w:t>
+        <w:t>Le département est choisi dans une liste fermée : CROUPIERS, ROOM_MANAGERS, CAISSE, POKER, SLOTS, HOUSEKEEPING, RESTAURANT, BAR, RECEPTION_HOTEL, RECEPTION_CASINO, HOTEL_AUTRES, MAINTENANCE, SECURITE, MARKETING, COMPTA, RH, DIRECTION, WELLNESS, SALLES, AUTRE. Les deux derniers éléments sont le nom de la tâche et le mois de rédaction. Word ajoutera l’extension tout seul à l’enregistrement.</w:t>
       </w:r>
     </w:p>
     <w:p>

</xml_diff>

<commit_message>
Préciser SALLES et ROOM_MANAGERS sur la page des procédures
Co-Authored-By: Claude Opus 5 <noreply@anthropic.com>
</commit_message>
<xml_diff>
--- a/fichiers/1 - Mode d'emploi - decrire une procedure avec une IA.docx
+++ b/fichiers/1 - Mode d'emploi - decrire une procedure avec une IA.docx
@@ -241,6 +241,20 @@
           <w:i w:val="0"/>
         </w:rPr>
         <w:t>Le département est choisi dans une liste fermée : CROUPIERS, ROOM_MANAGERS, CAISSE, POKER, SLOTS, HOUSEKEEPING, RESTAURANT, BAR, RECEPTION_HOTEL, RECEPTION_CASINO, HOTEL_AUTRES, MAINTENANCE, SECURITE, MARKETING, COMPTA, RH, DIRECTION, WELLNESS, SALLES, AUTRE. Les deux derniers éléments sont le nom de la tâche et le mois de rédaction. Word ajoutera l’extension tout seul à l’enregistrement.</w:t>
+      </w:r>
+    </w:p>
+    <w:p>
+      <w:r>
+        <w:rPr>
+          <w:b/>
+        </w:rPr>
+        <w:t xml:space="preserve">Deux valeurs à ne pas confondre. </w:t>
+      </w:r>
+      <w:r>
+        <w:rPr>
+          <w:i w:val="0"/>
+        </w:rPr>
+        <w:t>SALLES est la gestion des salles — location et événements, l’équipe Event. ROOM_MANAGERS, ce sont les responsables des tables de jeux.</w:t>
       </w:r>
     </w:p>
     <w:p>

</xml_diff>

<commit_message>
Livraison en fichier Word sur la page des procédures
Co-Authored-By: Claude Opus 5 <noreply@anthropic.com>
</commit_message>
<xml_diff>
--- a/fichiers/1 - Mode d'emploi - decrire une procedure avec une IA.docx
+++ b/fichiers/1 - Mode d'emploi - decrire une procedure avec une IA.docx
@@ -146,10 +146,10 @@
         <w:rPr>
           <w:b/>
         </w:rPr>
-        <w:t>À la fin, l’IA écrit la procédure</w:t>
+        <w:t>À la fin, l’IA livre la procédure en fichier Word</w:t>
       </w:r>
       <w:r>
-        <w:t xml:space="preserve"> — avec un sommaire si elle est longue — et vous donne le nom sous lequel l’enregistrer. Copiez-la et transmettez-la.</w:t>
+        <w:t>, nommé selon la nomenclature, avec un sommaire si elle est longue. Si l’IA que vous utilisez ne sait pas fabriquer de fichier, elle doit le dire et vous donner le texte à coller dans Word.</w:t>
       </w:r>
     </w:p>
     <w:p>
@@ -232,7 +232,7 @@
         <w:rPr>
           <w:i/>
         </w:rPr>
-        <w:t>procedure-CCRN-CAISSE-comptage-caisse-fin-de-service-2026-09</w:t>
+        <w:t>procedure-CCRN-CAISSE-comptage-caisse-fin-de-service-2026-09.docx</w:t>
       </w:r>
     </w:p>
     <w:p>
@@ -240,7 +240,7 @@
         <w:rPr>
           <w:i w:val="0"/>
         </w:rPr>
-        <w:t>Le département est choisi dans une liste fermée : CROUPIERS, ROOM_MANAGERS, CAISSE, POKER, SLOTS, HOUSEKEEPING, RESTAURANT, BAR, RECEPTION_HOTEL, RECEPTION_CASINO, HOTEL_AUTRES, MAINTENANCE, SECURITE, MARKETING, COMPTA, RH, DIRECTION, WELLNESS, SALLES, AUTRE. Les deux derniers éléments sont le nom de la tâche et le mois de rédaction. Word ajoutera l’extension tout seul à l’enregistrement.</w:t>
+        <w:t>Le département est choisi dans une liste fermée : CROUPIERS, ROOM_MANAGERS, CAISSE, POKER, SLOTS, HOUSEKEEPING, RESTAURANT, BAR, RECEPTION_HOTEL, RECEPTION_CASINO, HOTEL_AUTRES, MAINTENANCE, SECURITE, MARKETING, COMPTA, RH, DIRECTION, WELLNESS, SALLES, AUTRE. Les deux derniers éléments sont le nom de la tâche et le mois de rédaction.</w:t>
       </w:r>
     </w:p>
     <w:p>

</xml_diff>

<commit_message>
Le pourquoi sur la page des procédures
Co-Authored-By: Claude Opus 5 <noreply@anthropic.com>
</commit_message>
<xml_diff>
--- a/fichiers/1 - Mode d'emploi - decrire une procedure avec une IA.docx
+++ b/fichiers/1 - Mode d'emploi - decrire une procedure avec une IA.docx
@@ -291,6 +291,20 @@
           <w:i w:val="0"/>
         </w:rPr>
         <w:t>Une procédure longue sort avec un sommaire en tête, qui reprend les sections et les étapes numérotées — une simple liste, sans liens cliquables. Si vous voulez une table des matières automatique, Word la génère en deux clics : les titres du document sont déjà hiérarchisés pour ça.</w:t>
+      </w:r>
+    </w:p>
+    <w:p>
+      <w:r>
+        <w:rPr>
+          <w:b/>
+        </w:rPr>
+        <w:t xml:space="preserve">Le pourquoi. </w:t>
+      </w:r>
+      <w:r>
+        <w:rPr>
+          <w:i w:val="0"/>
+        </w:rPr>
+        <w:t>Tout au long de l’entretien, elle vous demande aussi pourquoi on fait les choses ainsi : à quoi sert cette étape, ce qu’on évite, pourquoi comme ça et pas autrement. Ces réponses apparaissent en italique dans la procédure, sous la ligne qu’elles expliquent — celui qui est pressé les saute, celui qui veut comprendre s’y arrête.</w:t>
       </w:r>
     </w:p>
     <w:p>

</xml_diff>